<commit_message>
Programme Management: Replace POL-001 Engineering Policies with controlled production version
</commit_message>
<xml_diff>
--- a/tooling/ProgrammeManagement/00 Programme Office/POL-001 Engineering Policies.docx
+++ b/tooling/ProgrammeManagement/00 Programme Office/POL-001 Engineering Policies.docx
@@ -4,35 +4,46 @@
   <w:body>
     <w:p>
       <w:pPr>
-        <w:pStyle w:val="Heading1"/>
+        <w:jc w:val="center"/>
       </w:pPr>
       <w:r>
-        <w:t>JUSTDEFENDERS® PROGRAMME MANAGEMENT SYSTEM</w:t>
+        <w:rPr>
+          <w:b/>
+          <w:sz w:val="44"/>
+        </w:rPr>
+        <w:t>POL-001</w:t>
+        <w:br/>
+        <w:t>Engineering Policies</w:t>
+        <w:br/>
+        <w:br/>
+      </w:r>
+    </w:p>
+    <w:p>
+      <w:r>
+        <w:t>Repository: tooling\ProgrammeManagement\00 Programme Office\</w:t>
+      </w:r>
+    </w:p>
+    <w:p>
+      <w:r>
+        <w:t>Filename: POL-001 Engineering Policies.docx</w:t>
+      </w:r>
+    </w:p>
+    <w:p>
+      <w:r>
+        <w:br w:type="page"/>
       </w:r>
     </w:p>
     <w:p>
       <w:pPr>
-        <w:pStyle w:val="Heading2"/>
+        <w:pStyle w:val="Heading1"/>
       </w:pPr>
       <w:r>
-        <w:t>POL-001 Engineering Policies</w:t>
-      </w:r>
-    </w:p>
-    <w:p>
-      <w:r>
-        <w:t>Defines the engineering policies governing the JustDefenders Programme.</w:t>
-      </w:r>
-    </w:p>
-    <w:p>
-      <w:pPr>
-        <w:pStyle w:val="Heading2"/>
-      </w:pPr>
-      <w:r>
-        <w:t>Engineering Control</w:t>
+        <w:t>Engineering Control Record</w:t>
       </w:r>
     </w:p>
     <w:tbl>
       <w:tblPr>
+        <w:tblStyle w:val="TableGrid"/>
         <w:tblW w:type="auto" w:w="0"/>
         <w:tblLook w:firstColumn="1" w:firstRow="1" w:lastColumn="0" w:lastRow="0" w:noHBand="0" w:noVBand="1" w:val="04A0"/>
       </w:tblPr>
@@ -40,6 +51,72 @@
         <w:gridCol w:w="4320"/>
         <w:gridCol w:w="4320"/>
       </w:tblGrid>
+      <w:tr>
+        <w:tc>
+          <w:tcPr>
+            <w:tcW w:type="dxa" w:w="4320"/>
+          </w:tcPr>
+          <w:p>
+            <w:r>
+              <w:t>Field</w:t>
+            </w:r>
+          </w:p>
+        </w:tc>
+        <w:tc>
+          <w:tcPr>
+            <w:tcW w:type="dxa" w:w="4320"/>
+          </w:tcPr>
+          <w:p>
+            <w:r>
+              <w:t>Value</w:t>
+            </w:r>
+          </w:p>
+        </w:tc>
+      </w:tr>
+      <w:tr>
+        <w:tc>
+          <w:tcPr>
+            <w:tcW w:type="dxa" w:w="4320"/>
+          </w:tcPr>
+          <w:p>
+            <w:r>
+              <w:t>Document ID</w:t>
+            </w:r>
+          </w:p>
+        </w:tc>
+        <w:tc>
+          <w:tcPr>
+            <w:tcW w:type="dxa" w:w="4320"/>
+          </w:tcPr>
+          <w:p>
+            <w:r>
+              <w:t>POL-001</w:t>
+            </w:r>
+          </w:p>
+        </w:tc>
+      </w:tr>
+      <w:tr>
+        <w:tc>
+          <w:tcPr>
+            <w:tcW w:type="dxa" w:w="4320"/>
+          </w:tcPr>
+          <w:p>
+            <w:r>
+              <w:t>Title</w:t>
+            </w:r>
+          </w:p>
+        </w:tc>
+        <w:tc>
+          <w:tcPr>
+            <w:tcW w:type="dxa" w:w="4320"/>
+          </w:tcPr>
+          <w:p>
+            <w:r>
+              <w:t>Engineering Policies</w:t>
+            </w:r>
+          </w:p>
+        </w:tc>
+      </w:tr>
       <w:tr>
         <w:tc>
           <w:tcPr>
@@ -58,6 +135,94 @@
           <w:p>
             <w:r>
               <w:t>CONTROLLED</w:t>
+            </w:r>
+          </w:p>
+        </w:tc>
+      </w:tr>
+      <w:tr>
+        <w:tc>
+          <w:tcPr>
+            <w:tcW w:type="dxa" w:w="4320"/>
+          </w:tcPr>
+          <w:p>
+            <w:r>
+              <w:t>Version</w:t>
+            </w:r>
+          </w:p>
+        </w:tc>
+        <w:tc>
+          <w:tcPr>
+            <w:tcW w:type="dxa" w:w="4320"/>
+          </w:tcPr>
+          <w:p>
+            <w:r>
+              <w:t>1.0</w:t>
+            </w:r>
+          </w:p>
+        </w:tc>
+      </w:tr>
+      <w:tr>
+        <w:tc>
+          <w:tcPr>
+            <w:tcW w:type="dxa" w:w="4320"/>
+          </w:tcPr>
+          <w:p>
+            <w:r>
+              <w:t>Owner</w:t>
+            </w:r>
+          </w:p>
+        </w:tc>
+        <w:tc>
+          <w:tcPr>
+            <w:tcW w:type="dxa" w:w="4320"/>
+          </w:tcPr>
+          <w:p>
+            <w:r>
+              <w:t>Programme Office</w:t>
+            </w:r>
+          </w:p>
+        </w:tc>
+      </w:tr>
+      <w:tr>
+        <w:tc>
+          <w:tcPr>
+            <w:tcW w:type="dxa" w:w="4320"/>
+          </w:tcPr>
+          <w:p>
+            <w:r>
+              <w:t>Repository Path</w:t>
+            </w:r>
+          </w:p>
+        </w:tc>
+        <w:tc>
+          <w:tcPr>
+            <w:tcW w:type="dxa" w:w="4320"/>
+          </w:tcPr>
+          <w:p>
+            <w:r>
+              <w:t>tooling\ProgrammeManagement\00 Programme Office\</w:t>
+            </w:r>
+          </w:p>
+        </w:tc>
+      </w:tr>
+      <w:tr>
+        <w:tc>
+          <w:tcPr>
+            <w:tcW w:type="dxa" w:w="4320"/>
+          </w:tcPr>
+          <w:p>
+            <w:r>
+              <w:t>Filename</w:t>
+            </w:r>
+          </w:p>
+        </w:tc>
+        <w:tc>
+          <w:tcPr>
+            <w:tcW w:type="dxa" w:w="4320"/>
+          </w:tcPr>
+          <w:p>
+            <w:r>
+              <w:t>POL-001 Engineering Policies.docx</w:t>
             </w:r>
           </w:p>
         </w:tc>
@@ -91,7 +256,247 @@
           </w:tcPr>
           <w:p>
             <w:r>
-              <w:t>Repository Path</w:t>
+              <w:t>Last Updated</w:t>
+            </w:r>
+          </w:p>
+        </w:tc>
+        <w:tc>
+          <w:tcPr>
+            <w:tcW w:type="dxa" w:w="4320"/>
+          </w:tcPr>
+          <w:p>
+            <w:r/>
+          </w:p>
+        </w:tc>
+      </w:tr>
+      <w:tr>
+        <w:tc>
+          <w:tcPr>
+            <w:tcW w:type="dxa" w:w="4320"/>
+          </w:tcPr>
+          <w:p>
+            <w:r>
+              <w:t>Next Review</w:t>
+            </w:r>
+          </w:p>
+        </w:tc>
+        <w:tc>
+          <w:tcPr>
+            <w:tcW w:type="dxa" w:w="4320"/>
+          </w:tcPr>
+          <w:p>
+            <w:r/>
+          </w:p>
+        </w:tc>
+      </w:tr>
+    </w:tbl>
+    <w:p>
+      <w:pPr>
+        <w:pStyle w:val="Heading1"/>
+      </w:pPr>
+      <w:r>
+        <w:t>Revision History</w:t>
+      </w:r>
+    </w:p>
+    <w:tbl>
+      <w:tblPr>
+        <w:tblStyle w:val="TableGrid"/>
+        <w:tblW w:type="auto" w:w="0"/>
+        <w:tblLook w:firstColumn="1" w:firstRow="1" w:lastColumn="0" w:lastRow="0" w:noHBand="0" w:noVBand="1" w:val="04A0"/>
+      </w:tblPr>
+      <w:tblGrid>
+        <w:gridCol w:w="1728"/>
+        <w:gridCol w:w="1728"/>
+        <w:gridCol w:w="1728"/>
+        <w:gridCol w:w="1728"/>
+        <w:gridCol w:w="1728"/>
+      </w:tblGrid>
+      <w:tr>
+        <w:tc>
+          <w:tcPr>
+            <w:tcW w:type="dxa" w:w="1728"/>
+          </w:tcPr>
+          <w:p>
+            <w:r>
+              <w:t>Version</w:t>
+            </w:r>
+          </w:p>
+        </w:tc>
+        <w:tc>
+          <w:tcPr>
+            <w:tcW w:type="dxa" w:w="1728"/>
+          </w:tcPr>
+          <w:p>
+            <w:r>
+              <w:t>Date</w:t>
+            </w:r>
+          </w:p>
+        </w:tc>
+        <w:tc>
+          <w:tcPr>
+            <w:tcW w:type="dxa" w:w="1728"/>
+          </w:tcPr>
+          <w:p>
+            <w:r>
+              <w:t>Author</w:t>
+            </w:r>
+          </w:p>
+        </w:tc>
+        <w:tc>
+          <w:tcPr>
+            <w:tcW w:type="dxa" w:w="1728"/>
+          </w:tcPr>
+          <w:p>
+            <w:r>
+              <w:t>Change</w:t>
+            </w:r>
+          </w:p>
+        </w:tc>
+        <w:tc>
+          <w:tcPr>
+            <w:tcW w:type="dxa" w:w="1728"/>
+          </w:tcPr>
+          <w:p>
+            <w:r>
+              <w:t>Status</w:t>
+            </w:r>
+          </w:p>
+        </w:tc>
+      </w:tr>
+      <w:tr>
+        <w:tc>
+          <w:tcPr>
+            <w:tcW w:type="dxa" w:w="1728"/>
+          </w:tcPr>
+          <w:p>
+            <w:r>
+              <w:t>1.0</w:t>
+            </w:r>
+          </w:p>
+        </w:tc>
+        <w:tc>
+          <w:tcPr>
+            <w:tcW w:type="dxa" w:w="1728"/>
+          </w:tcPr>
+          <w:p>
+            <w:r/>
+          </w:p>
+        </w:tc>
+        <w:tc>
+          <w:tcPr>
+            <w:tcW w:type="dxa" w:w="1728"/>
+          </w:tcPr>
+          <w:p>
+            <w:r>
+              <w:t>Programme Office</w:t>
+            </w:r>
+          </w:p>
+        </w:tc>
+        <w:tc>
+          <w:tcPr>
+            <w:tcW w:type="dxa" w:w="1728"/>
+          </w:tcPr>
+          <w:p>
+            <w:r>
+              <w:t>Initial Issue</w:t>
+            </w:r>
+          </w:p>
+        </w:tc>
+        <w:tc>
+          <w:tcPr>
+            <w:tcW w:type="dxa" w:w="1728"/>
+          </w:tcPr>
+          <w:p>
+            <w:r>
+              <w:t>CONTROLLED</w:t>
+            </w:r>
+          </w:p>
+        </w:tc>
+      </w:tr>
+    </w:tbl>
+    <w:p>
+      <w:pPr>
+        <w:pStyle w:val="Heading1"/>
+      </w:pPr>
+      <w:r>
+        <w:t>Table of Contents</w:t>
+      </w:r>
+    </w:p>
+    <w:p>
+      <w:r>
+        <w:t>1. Cover Page</w:t>
+        <w:br/>
+        <w:t>2. Engineering Control Record</w:t>
+        <w:br/>
+        <w:t>3. Revision History</w:t>
+        <w:br/>
+        <w:t>4. Table of Contents</w:t>
+        <w:br/>
+        <w:t>5. Purpose</w:t>
+        <w:br/>
+        <w:t>6. Scope</w:t>
+        <w:br/>
+        <w:t>7. Engineering Policies</w:t>
+        <w:br/>
+        <w:t>8. Responsibilities</w:t>
+        <w:br/>
+        <w:t>9. Related Documents</w:t>
+        <w:br/>
+        <w:t>10. Appendices</w:t>
+      </w:r>
+    </w:p>
+    <w:p>
+      <w:pPr>
+        <w:pStyle w:val="Heading1"/>
+      </w:pPr>
+      <w:r>
+        <w:t>Purpose</w:t>
+      </w:r>
+    </w:p>
+    <w:p>
+      <w:r>
+        <w:t>Defines the engineering policies governing every work package, engineering artefact, register, operational procedure and software component within the JustDefenders Programme Management System.</w:t>
+      </w:r>
+    </w:p>
+    <w:p>
+      <w:pPr>
+        <w:pStyle w:val="Heading1"/>
+      </w:pPr>
+      <w:r>
+        <w:t>Scope</w:t>
+      </w:r>
+    </w:p>
+    <w:p>
+      <w:r>
+        <w:t>Applies to all programme engineering activities and controlled engineering artefacts.</w:t>
+      </w:r>
+    </w:p>
+    <w:p>
+      <w:pPr>
+        <w:pStyle w:val="Heading1"/>
+      </w:pPr>
+      <w:r>
+        <w:t>Engineering Policies</w:t>
+      </w:r>
+    </w:p>
+    <w:tbl>
+      <w:tblPr>
+        <w:tblStyle w:val="TableGrid"/>
+        <w:tblW w:type="auto" w:w="0"/>
+        <w:tblLook w:firstColumn="1" w:firstRow="1" w:lastColumn="0" w:lastRow="0" w:noHBand="0" w:noVBand="1" w:val="04A0"/>
+      </w:tblPr>
+      <w:tblGrid>
+        <w:gridCol w:w="4320"/>
+        <w:gridCol w:w="4320"/>
+      </w:tblGrid>
+      <w:tr>
+        <w:tc>
+          <w:tcPr>
+            <w:tcW w:type="dxa" w:w="4320"/>
+          </w:tcPr>
+          <w:p>
+            <w:r>
+              <w:t>Policy</w:t>
             </w:r>
           </w:p>
         </w:tc>
@@ -101,7 +506,7 @@
           </w:tcPr>
           <w:p>
             <w:r>
-              <w:t>ProgrammeManagement\00 Programme Office\</w:t>
+              <w:t>Statement</w:t>
             </w:r>
           </w:p>
         </w:tc>
@@ -113,7 +518,7 @@
           </w:tcPr>
           <w:p>
             <w:r>
-              <w:t>Owner</w:t>
+              <w:t>EP-001</w:t>
             </w:r>
           </w:p>
         </w:tc>
@@ -123,7 +528,7 @@
           </w:tcPr>
           <w:p>
             <w:r>
-              <w:t>Programme Office</w:t>
+              <w:t>If it isn't in the ECMDB, it isn't under engineering control.</w:t>
             </w:r>
           </w:p>
         </w:tc>
@@ -135,7 +540,7 @@
           </w:tcPr>
           <w:p>
             <w:r>
-              <w:t>Version</w:t>
+              <w:t>EP-002</w:t>
             </w:r>
           </w:p>
         </w:tc>
@@ -145,7 +550,7 @@
           </w:tcPr>
           <w:p>
             <w:r>
-              <w:t>1.0</w:t>
+              <w:t>Every engineering asset has one authoritative record.</w:t>
             </w:r>
           </w:p>
         </w:tc>
@@ -157,7 +562,7 @@
           </w:tcPr>
           <w:p>
             <w:r>
-              <w:t>Date</w:t>
+              <w:t>EP-003</w:t>
             </w:r>
           </w:p>
         </w:tc>
@@ -167,12 +572,301 @@
           </w:tcPr>
           <w:p>
             <w:r>
-              <w:t>02 August 2026</w:t>
+              <w:t>Knowledge is a programme asset.</w:t>
+            </w:r>
+          </w:p>
+        </w:tc>
+      </w:tr>
+      <w:tr>
+        <w:tc>
+          <w:tcPr>
+            <w:tcW w:type="dxa" w:w="4320"/>
+          </w:tcPr>
+          <w:p>
+            <w:r>
+              <w:t>EP-004</w:t>
+            </w:r>
+          </w:p>
+        </w:tc>
+        <w:tc>
+          <w:tcPr>
+            <w:tcW w:type="dxa" w:w="4320"/>
+          </w:tcPr>
+          <w:p>
+            <w:r>
+              <w:t>Recovery must be demonstrated, not assumed.</w:t>
+            </w:r>
+          </w:p>
+        </w:tc>
+      </w:tr>
+      <w:tr>
+        <w:tc>
+          <w:tcPr>
+            <w:tcW w:type="dxa" w:w="4320"/>
+          </w:tcPr>
+          <w:p>
+            <w:r>
+              <w:t>EP-005</w:t>
+            </w:r>
+          </w:p>
+        </w:tc>
+        <w:tc>
+          <w:tcPr>
+            <w:tcW w:type="dxa" w:w="4320"/>
+          </w:tcPr>
+          <w:p>
+            <w:r>
+              <w:t>Every engineering asset has an owner.</w:t>
+            </w:r>
+          </w:p>
+        </w:tc>
+      </w:tr>
+      <w:tr>
+        <w:tc>
+          <w:tcPr>
+            <w:tcW w:type="dxa" w:w="4320"/>
+          </w:tcPr>
+          <w:p>
+            <w:r>
+              <w:t>EP-006</w:t>
+            </w:r>
+          </w:p>
+        </w:tc>
+        <w:tc>
+          <w:tcPr>
+            <w:tcW w:type="dxa" w:w="4320"/>
+          </w:tcPr>
+          <w:p>
+            <w:r>
+              <w:t>One work package per Engineering Chat.</w:t>
+            </w:r>
+          </w:p>
+        </w:tc>
+      </w:tr>
+      <w:tr>
+        <w:tc>
+          <w:tcPr>
+            <w:tcW w:type="dxa" w:w="4320"/>
+          </w:tcPr>
+          <w:p>
+            <w:r>
+              <w:t>EP-007</w:t>
+            </w:r>
+          </w:p>
+        </w:tc>
+        <w:tc>
+          <w:tcPr>
+            <w:tcW w:type="dxa" w:w="4320"/>
+          </w:tcPr>
+          <w:p>
+            <w:r>
+              <w:t>The Programme Office governs. Engineering Chats deliver.</w:t>
+            </w:r>
+          </w:p>
+        </w:tc>
+      </w:tr>
+      <w:tr>
+        <w:tc>
+          <w:tcPr>
+            <w:tcW w:type="dxa" w:w="4320"/>
+          </w:tcPr>
+          <w:p>
+            <w:r>
+              <w:t>EP-008</w:t>
+            </w:r>
+          </w:p>
+        </w:tc>
+        <w:tc>
+          <w:tcPr>
+            <w:tcW w:type="dxa" w:w="4320"/>
+          </w:tcPr>
+          <w:p>
+            <w:r>
+              <w:t>Capture first. Improve later.</w:t>
+            </w:r>
+          </w:p>
+        </w:tc>
+      </w:tr>
+      <w:tr>
+        <w:tc>
+          <w:tcPr>
+            <w:tcW w:type="dxa" w:w="4320"/>
+          </w:tcPr>
+          <w:p>
+            <w:r>
+              <w:t>EP-009</w:t>
+            </w:r>
+          </w:p>
+        </w:tc>
+        <w:tc>
+          <w:tcPr>
+            <w:tcW w:type="dxa" w:w="4320"/>
+          </w:tcPr>
+          <w:p>
+            <w:r>
+              <w:t>No single point of failure.</w:t>
+            </w:r>
+          </w:p>
+        </w:tc>
+      </w:tr>
+      <w:tr>
+        <w:tc>
+          <w:tcPr>
+            <w:tcW w:type="dxa" w:w="4320"/>
+          </w:tcPr>
+          <w:p>
+            <w:r>
+              <w:t>EP-010</w:t>
+            </w:r>
+          </w:p>
+        </w:tc>
+        <w:tc>
+          <w:tcPr>
+            <w:tcW w:type="dxa" w:w="4320"/>
+          </w:tcPr>
+          <w:p>
+            <w:r>
+              <w:t>Engineer the engineering.</w:t>
+            </w:r>
+          </w:p>
+        </w:tc>
+      </w:tr>
+      <w:tr>
+        <w:tc>
+          <w:tcPr>
+            <w:tcW w:type="dxa" w:w="4320"/>
+          </w:tcPr>
+          <w:p>
+            <w:r>
+              <w:t>EP-011</w:t>
+            </w:r>
+          </w:p>
+        </w:tc>
+        <w:tc>
+          <w:tcPr>
+            <w:tcW w:type="dxa" w:w="4320"/>
+          </w:tcPr>
+          <w:p>
+            <w:r>
+              <w:t>Every engineering activity shall trace to a programme objective and milestone.</w:t>
+            </w:r>
+          </w:p>
+        </w:tc>
+      </w:tr>
+      <w:tr>
+        <w:tc>
+          <w:tcPr>
+            <w:tcW w:type="dxa" w:w="4320"/>
+          </w:tcPr>
+          <w:p>
+            <w:r>
+              <w:t>EP-012</w:t>
+            </w:r>
+          </w:p>
+        </w:tc>
+        <w:tc>
+          <w:tcPr>
+            <w:tcW w:type="dxa" w:w="4320"/>
+          </w:tcPr>
+          <w:p>
+            <w:r>
+              <w:t>The platform shall evolve towards secure remote monitoring and management.</w:t>
+            </w:r>
+          </w:p>
+        </w:tc>
+      </w:tr>
+      <w:tr>
+        <w:tc>
+          <w:tcPr>
+            <w:tcW w:type="dxa" w:w="4320"/>
+          </w:tcPr>
+          <w:p>
+            <w:r>
+              <w:t>EP-013</w:t>
+            </w:r>
+          </w:p>
+        </w:tc>
+        <w:tc>
+          <w:tcPr>
+            <w:tcW w:type="dxa" w:w="4320"/>
+          </w:tcPr>
+          <w:p>
+            <w:r>
+              <w:t>Every controlled engineering document shall have one authoritative working copy within the Git repository.</w:t>
+            </w:r>
+          </w:p>
+        </w:tc>
+      </w:tr>
+      <w:tr>
+        <w:tc>
+          <w:tcPr>
+            <w:tcW w:type="dxa" w:w="4320"/>
+          </w:tcPr>
+          <w:p>
+            <w:r>
+              <w:t>EP-014</w:t>
+            </w:r>
+          </w:p>
+        </w:tc>
+        <w:tc>
+          <w:tcPr>
+            <w:tcW w:type="dxa" w:w="4320"/>
+          </w:tcPr>
+          <w:p>
+            <w:r>
+              <w:t>Every controlled engineering document shall display its lifecycle state prominently.</w:t>
             </w:r>
           </w:p>
         </w:tc>
       </w:tr>
     </w:tbl>
+    <w:p>
+      <w:pPr>
+        <w:pStyle w:val="Heading1"/>
+      </w:pPr>
+      <w:r>
+        <w:t>Responsibilities</w:t>
+      </w:r>
+    </w:p>
+    <w:p>
+      <w:r>
+        <w:t>Programme Office: Govern controlled engineering documentation, policy, baselines and lifecycle.</w:t>
+        <w:br/>
+        <w:t>Engineering Chats: Deliver approved work packages in accordance with programme policy.</w:t>
+      </w:r>
+    </w:p>
+    <w:p>
+      <w:pPr>
+        <w:pStyle w:val="Heading1"/>
+      </w:pPr>
+      <w:r>
+        <w:t>Related Documents</w:t>
+      </w:r>
+    </w:p>
+    <w:p>
+      <w:r>
+        <w:t>ECMDB</w:t>
+        <w:br/>
+        <w:t>Engineering Work Packages</w:t>
+        <w:br/>
+        <w:t>Controlled Registers</w:t>
+        <w:br/>
+        <w:t>Engineering Baselines</w:t>
+      </w:r>
+    </w:p>
+    <w:p>
+      <w:pPr>
+        <w:pStyle w:val="Heading1"/>
+      </w:pPr>
+      <w:r>
+        <w:t>Appendices</w:t>
+      </w:r>
+    </w:p>
+    <w:p>
+      <w:r>
+        <w:t>None.</w:t>
+      </w:r>
+    </w:p>
     <w:sectPr>
       <w:pgSz w:w="12240" w:h="15840"/>
       <w:pgMar w:top="1440" w:right="1800" w:bottom="1440" w:left="1800" w:header="720" w:footer="720" w:gutter="0"/>

</xml_diff>